<commit_message>
Updated CV and website documents
</commit_message>
<xml_diff>
--- a/CV.docx
+++ b/CV.docx
@@ -108,9 +108,96 @@
         <w:pBdr>
           <w:bottom w:val="single" w:sz="6" w:space="1" w:color="auto"/>
         </w:pBdr>
-      </w:pPr>
-      <w:r>
-        <w:t>I am interested in applying and developing tools for Earth observations specifically from NASA datasets. I want to create solutions to real-world problems and to provide resources for managers and decision makers to overcome these problems.</w:t>
+        <w:rPr>
+          <w:b/>
+          <w:bCs/>
+          <w:sz w:val="28"/>
+          <w:szCs w:val="28"/>
+        </w:rPr>
+      </w:pPr>
+      <w:r>
+        <w:rPr>
+          <w:b/>
+          <w:bCs/>
+          <w:sz w:val="28"/>
+          <w:szCs w:val="28"/>
+        </w:rPr>
+        <w:t>EDUCATION</w:t>
+      </w:r>
+    </w:p>
+    <w:p>
+      <w:pPr>
+        <w:ind w:left="720" w:hanging="720"/>
+      </w:pPr>
+      <w:r>
+        <w:t>2027</w:t>
+      </w:r>
+      <w:r>
+        <w:tab/>
+      </w:r>
+      <w:r>
+        <w:t>Master of Science, Forest Resource Conservation</w:t>
+      </w:r>
+      <w:r>
+        <w:t>,</w:t>
+      </w:r>
+      <w:r>
+        <w:t xml:space="preserve"> Concentration in Geomatics,</w:t>
+      </w:r>
+      <w:r>
+        <w:t xml:space="preserve"> </w:t>
+      </w:r>
+      <w:r>
+        <w:t>University of Florida (</w:t>
+      </w:r>
+      <w:r>
+        <w:t xml:space="preserve">4.0 GPA, </w:t>
+      </w:r>
+      <w:r>
+        <w:t xml:space="preserve">In Progress) </w:t>
+      </w:r>
+    </w:p>
+    <w:p>
+      <w:pPr>
+        <w:ind w:left="-5"/>
+      </w:pPr>
+      <w:r>
+        <w:t xml:space="preserve">2025 </w:t>
+      </w:r>
+      <w:r>
+        <w:t xml:space="preserve">   </w:t>
+      </w:r>
+      <w:r>
+        <w:t>Bachelor of Science, Forest Resources and Conservation</w:t>
+      </w:r>
+      <w:r>
+        <w:t>,</w:t>
+      </w:r>
+      <w:r>
+        <w:t xml:space="preserve"> University of Florida</w:t>
+      </w:r>
+    </w:p>
+    <w:p>
+      <w:pPr>
+        <w:ind w:left="-5"/>
+      </w:pPr>
+      <w:r>
+        <w:t xml:space="preserve">2022 </w:t>
+      </w:r>
+      <w:r>
+        <w:t xml:space="preserve">   </w:t>
+      </w:r>
+      <w:r>
+        <w:t>Associate of Arts</w:t>
+      </w:r>
+      <w:r>
+        <w:t xml:space="preserve">, </w:t>
+      </w:r>
+      <w:r>
+        <w:t>Hillsborough Co</w:t>
+      </w:r>
+      <w:r>
+        <w:t>llege</w:t>
       </w:r>
     </w:p>
     <w:p>
@@ -132,39 +219,7 @@
           <w:sz w:val="28"/>
           <w:szCs w:val="28"/>
         </w:rPr>
-        <w:t>EDUCATION</w:t>
-      </w:r>
-    </w:p>
-    <w:p>
-      <w:pPr>
-        <w:ind w:left="720" w:hanging="720"/>
-      </w:pPr>
-      <w:r>
-        <w:t>2027</w:t>
-      </w:r>
-      <w:r>
-        <w:tab/>
-      </w:r>
-      <w:r>
-        <w:t>Master of Science, Forest Resource Conservation</w:t>
-      </w:r>
-      <w:r>
-        <w:t>,</w:t>
-      </w:r>
-      <w:r>
-        <w:t xml:space="preserve"> Concentration in Geomatics,</w:t>
-      </w:r>
-      <w:r>
-        <w:t xml:space="preserve"> </w:t>
-      </w:r>
-      <w:r>
-        <w:t>University of Florida (</w:t>
-      </w:r>
-      <w:r>
-        <w:t xml:space="preserve">4.0 GPA, </w:t>
-      </w:r>
-      <w:r>
-        <w:t xml:space="preserve">In Progress) </w:t>
+        <w:t>TECHNICAL SKILLS</w:t>
       </w:r>
     </w:p>
     <w:p>
@@ -172,19 +227,7 @@
         <w:ind w:left="-5"/>
       </w:pPr>
       <w:r>
-        <w:t xml:space="preserve">2025 </w:t>
-      </w:r>
-      <w:r>
-        <w:t xml:space="preserve">   </w:t>
-      </w:r>
-      <w:r>
-        <w:t>Bachelor of Science, Forest Resources and Conservation</w:t>
-      </w:r>
-      <w:r>
-        <w:t>,</w:t>
-      </w:r>
-      <w:r>
-        <w:t xml:space="preserve"> University of Florida</w:t>
+        <w:t>Remote Sensing</w:t>
       </w:r>
     </w:p>
     <w:p>
@@ -192,22 +235,82 @@
         <w:ind w:left="-5"/>
       </w:pPr>
       <w:r>
-        <w:t xml:space="preserve">2022 </w:t>
-      </w:r>
-      <w:r>
-        <w:t xml:space="preserve">   </w:t>
-      </w:r>
-      <w:r>
-        <w:t>Associate of Arts</w:t>
-      </w:r>
-      <w:r>
-        <w:t xml:space="preserve">, </w:t>
-      </w:r>
-      <w:r>
-        <w:t>Hillsborough Co</w:t>
-      </w:r>
-      <w:r>
-        <w:t>llege</w:t>
+        <w:t>Geographic Information Systems</w:t>
+      </w:r>
+      <w:r>
+        <w:t xml:space="preserve"> (GIS)</w:t>
+      </w:r>
+    </w:p>
+    <w:p>
+      <w:pPr>
+        <w:ind w:left="-5"/>
+      </w:pPr>
+      <w:r>
+        <w:t>Earth Observation</w:t>
+      </w:r>
+    </w:p>
+    <w:p>
+      <w:pPr>
+        <w:ind w:left="-5"/>
+      </w:pPr>
+      <w:r>
+        <w:t>Earth Science</w:t>
+      </w:r>
+    </w:p>
+    <w:p>
+      <w:pPr>
+        <w:ind w:left="-5"/>
+      </w:pPr>
+      <w:r>
+        <w:t>Environmental Science</w:t>
+      </w:r>
+    </w:p>
+    <w:p>
+      <w:pPr>
+        <w:ind w:left="-5"/>
+      </w:pPr>
+      <w:r>
+        <w:t>Geospatial Analysis</w:t>
+      </w:r>
+    </w:p>
+    <w:p>
+      <w:pPr>
+        <w:ind w:left="-5"/>
+      </w:pPr>
+      <w:r>
+        <w:t>Spatial Modeling</w:t>
+      </w:r>
+    </w:p>
+    <w:p>
+      <w:pPr>
+        <w:ind w:left="-5"/>
+      </w:pPr>
+      <w:r>
+        <w:t>Data Analysis</w:t>
+      </w:r>
+    </w:p>
+    <w:p>
+      <w:pPr>
+        <w:ind w:left="-5"/>
+      </w:pPr>
+      <w:r>
+        <w:t>Science Communication</w:t>
+      </w:r>
+    </w:p>
+    <w:p>
+      <w:pPr>
+        <w:ind w:left="-5"/>
+      </w:pPr>
+      <w:r>
+        <w:t>Team Collaboration</w:t>
+      </w:r>
+    </w:p>
+    <w:p>
+      <w:pPr>
+        <w:ind w:left="-5"/>
+      </w:pPr>
+      <w:r>
+        <w:t>Project Management</w:t>
       </w:r>
     </w:p>
     <w:p>
@@ -229,98 +332,27 @@
           <w:sz w:val="28"/>
           <w:szCs w:val="28"/>
         </w:rPr>
-        <w:t>TECHNICAL SKILLS</w:t>
-      </w:r>
-    </w:p>
-    <w:p>
-      <w:pPr>
-        <w:ind w:left="-5"/>
-      </w:pPr>
-      <w:r>
-        <w:t>Remote Sensing</w:t>
-      </w:r>
-    </w:p>
-    <w:p>
-      <w:pPr>
-        <w:ind w:left="-5"/>
-      </w:pPr>
-      <w:r>
-        <w:t>Geographic Information Systems</w:t>
-      </w:r>
-      <w:r>
-        <w:t xml:space="preserve"> (GIS)</w:t>
-      </w:r>
-    </w:p>
-    <w:p>
-      <w:pPr>
-        <w:ind w:left="-5"/>
-      </w:pPr>
-      <w:r>
-        <w:t>Earth Observation</w:t>
-      </w:r>
-    </w:p>
-    <w:p>
-      <w:pPr>
-        <w:ind w:left="-5"/>
-      </w:pPr>
-      <w:r>
-        <w:t>Earth Science</w:t>
-      </w:r>
-    </w:p>
-    <w:p>
-      <w:pPr>
-        <w:ind w:left="-5"/>
-      </w:pPr>
-      <w:r>
-        <w:t>Environmental Science</w:t>
-      </w:r>
-    </w:p>
-    <w:p>
-      <w:pPr>
-        <w:ind w:left="-5"/>
-      </w:pPr>
-      <w:r>
-        <w:t>Geospatial Analysis</w:t>
-      </w:r>
-    </w:p>
-    <w:p>
-      <w:pPr>
-        <w:ind w:left="-5"/>
-      </w:pPr>
-      <w:r>
-        <w:t>Spatial Modeling</w:t>
-      </w:r>
-    </w:p>
-    <w:p>
-      <w:pPr>
-        <w:ind w:left="-5"/>
-      </w:pPr>
-      <w:r>
-        <w:t>Data Analysis</w:t>
-      </w:r>
-    </w:p>
-    <w:p>
-      <w:pPr>
-        <w:ind w:left="-5"/>
-      </w:pPr>
-      <w:r>
-        <w:t>Science Communication</w:t>
-      </w:r>
-    </w:p>
-    <w:p>
-      <w:pPr>
-        <w:ind w:left="-5"/>
-      </w:pPr>
-      <w:r>
-        <w:t>Team Collaboration</w:t>
-      </w:r>
-    </w:p>
-    <w:p>
-      <w:pPr>
-        <w:ind w:left="-5"/>
-      </w:pPr>
-      <w:r>
-        <w:t>Project Management</w:t>
+        <w:t>CERTIFICATIONS</w:t>
+      </w:r>
+    </w:p>
+    <w:p>
+      <w:pPr>
+        <w:ind w:left="0" w:firstLine="0"/>
+      </w:pPr>
+      <w:r>
+        <w:t>2024</w:t>
+      </w:r>
+      <w:r>
+        <w:tab/>
+        <w:t>Environmental Policy, Law, and Regulation Certificate</w:t>
+      </w:r>
+    </w:p>
+    <w:p>
+      <w:pPr>
+        <w:ind w:left="0" w:firstLine="0"/>
+      </w:pPr>
+      <w:r>
+        <w:t xml:space="preserve">            College of Agricultural and Life Sciences, University of Florida</w:t>
       </w:r>
     </w:p>
     <w:p>
@@ -343,48 +375,6 @@
           <w:szCs w:val="28"/>
         </w:rPr>
         <w:lastRenderedPageBreak/>
-        <w:t>CERTIFICATIONS</w:t>
-      </w:r>
-    </w:p>
-    <w:p>
-      <w:pPr>
-        <w:ind w:left="0" w:firstLine="0"/>
-      </w:pPr>
-      <w:r>
-        <w:t>2024</w:t>
-      </w:r>
-      <w:r>
-        <w:tab/>
-        <w:t>Environmental Policy, Law, and Regulation Certificate</w:t>
-      </w:r>
-    </w:p>
-    <w:p>
-      <w:pPr>
-        <w:ind w:left="0" w:firstLine="0"/>
-      </w:pPr>
-      <w:r>
-        <w:t xml:space="preserve">            College of Agricultural and Life Sciences, University of Florida</w:t>
-      </w:r>
-    </w:p>
-    <w:p>
-      <w:pPr>
-        <w:pBdr>
-          <w:bottom w:val="single" w:sz="6" w:space="1" w:color="auto"/>
-        </w:pBdr>
-        <w:rPr>
-          <w:b/>
-          <w:bCs/>
-          <w:sz w:val="28"/>
-          <w:szCs w:val="28"/>
-        </w:rPr>
-      </w:pPr>
-      <w:r>
-        <w:rPr>
-          <w:b/>
-          <w:bCs/>
-          <w:sz w:val="28"/>
-          <w:szCs w:val="28"/>
-        </w:rPr>
         <w:t>WORKSHOPS &amp; TRAINING</w:t>
       </w:r>
     </w:p>
@@ -721,7 +711,6 @@
         <w:spacing w:after="160" w:line="278" w:lineRule="auto"/>
       </w:pPr>
       <w:r>
-        <w:lastRenderedPageBreak/>
         <w:t>Manage schedules, budgets, and communication with multiple groups across government, private, and academic institutions.</w:t>
       </w:r>
     </w:p>
@@ -744,6 +733,7 @@
         <w:ind w:left="2160" w:hanging="2160"/>
       </w:pPr>
       <w:r>
+        <w:lastRenderedPageBreak/>
         <w:t>2023 – Present</w:t>
       </w:r>
       <w:r>
@@ -1116,123 +1106,123 @@
         <w:ind w:left="720" w:right="0" w:hanging="720"/>
       </w:pPr>
       <w:r>
+        <w:t>2026</w:t>
+      </w:r>
+      <w:r>
+        <w:tab/>
+      </w:r>
+      <w:r>
+        <w:t xml:space="preserve">Fused ICESat-2 and </w:t>
+      </w:r>
+      <w:proofErr w:type="spellStart"/>
+      <w:r>
+        <w:t>AlphaEarth</w:t>
+      </w:r>
+      <w:proofErr w:type="spellEnd"/>
+      <w:r>
+        <w:t xml:space="preserve"> embeddings reveal asymmetric canopy height change across the southeastern United States</w:t>
+      </w:r>
+      <w:r>
+        <w:t xml:space="preserve">. </w:t>
+      </w:r>
+      <w:proofErr w:type="spellStart"/>
+      <w:r>
+        <w:t>Alvitez</w:t>
+      </w:r>
+      <w:proofErr w:type="spellEnd"/>
+      <w:r>
+        <w:t>, C. et. al., 2026</w:t>
+      </w:r>
+    </w:p>
+    <w:p>
+      <w:pPr>
+        <w:ind w:left="705" w:right="0" w:hanging="720"/>
+      </w:pPr>
+      <w:r>
+        <w:t>202</w:t>
+      </w:r>
+      <w:r>
+        <w:t>6</w:t>
+      </w:r>
+      <w:r>
+        <w:t xml:space="preserve"> </w:t>
+      </w:r>
+      <w:r>
+        <w:t xml:space="preserve">   </w:t>
+      </w:r>
+      <w:r>
+        <w:t>Classification of Spanish moss from Terrestrial Laser Scanning 3D Point Clouds Using Unsupervised and Supervised Methods</w:t>
+      </w:r>
+      <w:r>
+        <w:t xml:space="preserve">. </w:t>
+      </w:r>
+      <w:r>
+        <w:rPr>
+          <w:b/>
+          <w:bCs/>
+        </w:rPr>
+        <w:t>Gaskins</w:t>
+      </w:r>
+      <w:r>
+        <w:rPr>
+          <w:b/>
+          <w:bCs/>
+        </w:rPr>
+        <w:t xml:space="preserve">, </w:t>
+      </w:r>
+      <w:r>
+        <w:rPr>
+          <w:b/>
+          <w:bCs/>
+        </w:rPr>
+        <w:t>A</w:t>
+      </w:r>
+      <w:r>
+        <w:rPr>
+          <w:b/>
+          <w:bCs/>
+        </w:rPr>
+        <w:t>.</w:t>
+      </w:r>
+      <w:r>
+        <w:t xml:space="preserve"> et al., 202</w:t>
+      </w:r>
+      <w:r>
+        <w:t>6</w:t>
+      </w:r>
+      <w:r>
+        <w:t>.</w:t>
+      </w:r>
+    </w:p>
+    <w:p>
+      <w:pPr>
+        <w:ind w:left="705" w:right="0" w:hanging="720"/>
+        <w:rPr>
+          <w:b/>
+          <w:bCs/>
+        </w:rPr>
+      </w:pPr>
+      <w:r>
+        <w:rPr>
+          <w:b/>
+          <w:bCs/>
+        </w:rPr>
+        <w:t xml:space="preserve">In </w:t>
+      </w:r>
+      <w:r>
+        <w:rPr>
+          <w:b/>
+          <w:bCs/>
+        </w:rPr>
+        <w:t>Preparation</w:t>
+      </w:r>
+    </w:p>
+    <w:p>
+      <w:pPr>
+        <w:ind w:left="720" w:right="0" w:hanging="720"/>
+      </w:pPr>
+      <w:r>
         <w:lastRenderedPageBreak/>
-        <w:t>2026</w:t>
-      </w:r>
-      <w:r>
-        <w:tab/>
-      </w:r>
-      <w:r>
-        <w:t xml:space="preserve">Fused ICESat-2 and </w:t>
-      </w:r>
-      <w:proofErr w:type="spellStart"/>
-      <w:r>
-        <w:t>AlphaEarth</w:t>
-      </w:r>
-      <w:proofErr w:type="spellEnd"/>
-      <w:r>
-        <w:t xml:space="preserve"> embeddings reveal asymmetric canopy height change across the southeastern United States</w:t>
-      </w:r>
-      <w:r>
-        <w:t xml:space="preserve">. </w:t>
-      </w:r>
-      <w:proofErr w:type="spellStart"/>
-      <w:r>
-        <w:t>Alvitez</w:t>
-      </w:r>
-      <w:proofErr w:type="spellEnd"/>
-      <w:r>
-        <w:t>, C. et. al., 2026</w:t>
-      </w:r>
-    </w:p>
-    <w:p>
-      <w:pPr>
-        <w:ind w:left="705" w:right="0" w:hanging="720"/>
-      </w:pPr>
-      <w:r>
-        <w:t>202</w:t>
-      </w:r>
-      <w:r>
-        <w:t>6</w:t>
-      </w:r>
-      <w:r>
-        <w:t xml:space="preserve"> </w:t>
-      </w:r>
-      <w:r>
-        <w:t xml:space="preserve">   </w:t>
-      </w:r>
-      <w:r>
-        <w:t>Classification of Spanish moss from Terrestrial Laser Scanning 3D Point Clouds Using Unsupervised and Supervised Methods</w:t>
-      </w:r>
-      <w:r>
-        <w:t xml:space="preserve">. </w:t>
-      </w:r>
-      <w:r>
-        <w:rPr>
-          <w:b/>
-          <w:bCs/>
-        </w:rPr>
-        <w:t>Gaskins</w:t>
-      </w:r>
-      <w:r>
-        <w:rPr>
-          <w:b/>
-          <w:bCs/>
-        </w:rPr>
-        <w:t xml:space="preserve">, </w:t>
-      </w:r>
-      <w:r>
-        <w:rPr>
-          <w:b/>
-          <w:bCs/>
-        </w:rPr>
-        <w:t>A</w:t>
-      </w:r>
-      <w:r>
-        <w:rPr>
-          <w:b/>
-          <w:bCs/>
-        </w:rPr>
-        <w:t>.</w:t>
-      </w:r>
-      <w:r>
-        <w:t xml:space="preserve"> et al., 202</w:t>
-      </w:r>
-      <w:r>
-        <w:t>6</w:t>
-      </w:r>
-      <w:r>
-        <w:t>.</w:t>
-      </w:r>
-    </w:p>
-    <w:p>
-      <w:pPr>
-        <w:ind w:left="705" w:right="0" w:hanging="720"/>
-        <w:rPr>
-          <w:b/>
-          <w:bCs/>
-        </w:rPr>
-      </w:pPr>
-      <w:r>
-        <w:rPr>
-          <w:b/>
-          <w:bCs/>
-        </w:rPr>
-        <w:t xml:space="preserve">In </w:t>
-      </w:r>
-      <w:r>
-        <w:rPr>
-          <w:b/>
-          <w:bCs/>
-        </w:rPr>
-        <w:t>Preparation</w:t>
-      </w:r>
-    </w:p>
-    <w:p>
-      <w:pPr>
-        <w:ind w:left="720" w:right="0" w:hanging="720"/>
-      </w:pPr>
-      <w:r>
         <w:t>2026</w:t>
       </w:r>
       <w:r>
@@ -1572,7 +1562,7 @@
           <w:rPr>
             <w:rStyle w:val="Hyperlink"/>
           </w:rPr>
-          <w:t>CRAN: Package FuelDeep3D</w:t>
+          <w:t>FuelDeep3D</w:t>
         </w:r>
       </w:hyperlink>
     </w:p>
@@ -1611,113 +1601,138 @@
     </w:p>
     <w:p>
       <w:r>
+        <w:t>2025</w:t>
+      </w:r>
+      <w:r>
+        <w:tab/>
+      </w:r>
+      <w:r>
+        <w:t>Presenter, Inter-REC Flash Talk Competition</w:t>
+      </w:r>
+      <w:r>
+        <w:t xml:space="preserve"> </w:t>
+      </w:r>
+      <w:r>
+        <w:t>(Oral Presentation)</w:t>
+      </w:r>
+    </w:p>
+    <w:p>
+      <w:r>
+        <w:t>2025</w:t>
+      </w:r>
+      <w:r>
+        <w:tab/>
+      </w:r>
+      <w:r>
+        <w:t xml:space="preserve">Volunteer, </w:t>
+      </w:r>
+      <w:r>
+        <w:t xml:space="preserve">4-H Youth Competition, UF – Austin Cary Forest, Gainesville, FL  </w:t>
+      </w:r>
+    </w:p>
+    <w:p>
+      <w:r>
+        <w:t>2025</w:t>
+      </w:r>
+      <w:r>
+        <w:tab/>
+      </w:r>
+      <w:r>
+        <w:t xml:space="preserve">Attendee, </w:t>
+      </w:r>
+      <w:r>
+        <w:t xml:space="preserve">NASA ICESat-2 Annual Science Team Meeting  </w:t>
+      </w:r>
+    </w:p>
+    <w:p>
+      <w:pPr>
+        <w:ind w:left="720" w:hanging="720"/>
+      </w:pPr>
+      <w:r>
         <w:lastRenderedPageBreak/>
+        <w:t>2025</w:t>
+      </w:r>
+      <w:r>
+        <w:tab/>
+      </w:r>
+      <w:r>
+        <w:t>Presenter, Forestry Graduate Student Organization Research Symposium</w:t>
+      </w:r>
+      <w:r>
+        <w:t xml:space="preserve"> </w:t>
+      </w:r>
+      <w:r>
+        <w:t>(Oral Presentation)</w:t>
+      </w:r>
+    </w:p>
+    <w:p>
+      <w:r>
+        <w:t>2025</w:t>
+      </w:r>
+      <w:r>
+        <w:tab/>
+      </w:r>
+      <w:r>
+        <w:t>Student Attendee, Southeastern Society of American Foresters Annual Meeting</w:t>
+      </w:r>
+    </w:p>
+    <w:p>
+      <w:r>
+        <w:t>2024</w:t>
+      </w:r>
+      <w:r>
+        <w:tab/>
+      </w:r>
+      <w:r>
+        <w:t>Student Attendee, Society of American Foresters National Convention</w:t>
+      </w:r>
+    </w:p>
+    <w:p>
+      <w:r>
+        <w:t>2024</w:t>
+      </w:r>
+      <w:r>
+        <w:tab/>
+      </w:r>
+      <w:r>
+        <w:t>Student Attendee, Southeastern Society of American Foresters Annual Meeting</w:t>
+      </w:r>
+    </w:p>
+    <w:p>
+      <w:pPr>
+        <w:ind w:left="705" w:right="0" w:hanging="720"/>
+        <w:rPr>
+          <w:b/>
+          <w:bCs/>
+        </w:rPr>
+      </w:pPr>
+      <w:r>
+        <w:rPr>
+          <w:b/>
+          <w:bCs/>
+        </w:rPr>
+        <w:t>Software Development</w:t>
+      </w:r>
+    </w:p>
+    <w:p>
+      <w:r>
         <w:t>2026</w:t>
       </w:r>
       <w:r>
         <w:tab/>
+        <w:t>Peer reviewer, Methods in Ecology and Evolution</w:t>
+      </w:r>
+    </w:p>
+    <w:p>
+      <w:r>
+        <w:t>2026</w:t>
+      </w:r>
+      <w:r>
+        <w:tab/>
         <w:t xml:space="preserve">Peer reviewer, </w:t>
       </w:r>
       <w:r>
         <w:t>International Journal of Applied Earth Observation and Geoinformation</w:t>
-      </w:r>
-    </w:p>
-    <w:p>
-      <w:r>
-        <w:t>2025</w:t>
-      </w:r>
-      <w:r>
-        <w:tab/>
-      </w:r>
-      <w:r>
-        <w:t>Presenter, Inter-REC Flash Talk Competition</w:t>
-      </w:r>
-      <w:r>
-        <w:t xml:space="preserve"> </w:t>
-      </w:r>
-      <w:r>
-        <w:t>(Oral Presentation)</w:t>
-      </w:r>
-    </w:p>
-    <w:p>
-      <w:r>
-        <w:t>2025</w:t>
-      </w:r>
-      <w:r>
-        <w:tab/>
-      </w:r>
-      <w:r>
-        <w:t xml:space="preserve">Volunteer, </w:t>
-      </w:r>
-      <w:r>
-        <w:t xml:space="preserve">4-H Youth Competition, UF – Austin Cary Forest, Gainesville, FL  </w:t>
-      </w:r>
-    </w:p>
-    <w:p>
-      <w:r>
-        <w:t>2025</w:t>
-      </w:r>
-      <w:r>
-        <w:tab/>
-      </w:r>
-      <w:r>
-        <w:t xml:space="preserve">Attendee, </w:t>
-      </w:r>
-      <w:r>
-        <w:t xml:space="preserve">NASA ICESat-2 Annual Science Team Meeting  </w:t>
-      </w:r>
-    </w:p>
-    <w:p>
-      <w:pPr>
-        <w:ind w:left="720" w:hanging="720"/>
-      </w:pPr>
-      <w:r>
-        <w:t>2025</w:t>
-      </w:r>
-      <w:r>
-        <w:tab/>
-      </w:r>
-      <w:r>
-        <w:t>Presenter, Forestry Graduate Student Organization Research Symposium</w:t>
-      </w:r>
-      <w:r>
-        <w:t xml:space="preserve"> </w:t>
-      </w:r>
-      <w:r>
-        <w:t>(Oral Presentation)</w:t>
-      </w:r>
-    </w:p>
-    <w:p>
-      <w:r>
-        <w:t>2025</w:t>
-      </w:r>
-      <w:r>
-        <w:tab/>
-      </w:r>
-      <w:r>
-        <w:t>Student Attendee, Southeastern Society of American Foresters Annual Meeting</w:t>
-      </w:r>
-    </w:p>
-    <w:p>
-      <w:r>
-        <w:t>2024</w:t>
-      </w:r>
-      <w:r>
-        <w:tab/>
-      </w:r>
-      <w:r>
-        <w:t>Student Attendee, Society of American Foresters National Convention</w:t>
-      </w:r>
-    </w:p>
-    <w:p>
-      <w:r>
-        <w:t>2024</w:t>
-      </w:r>
-      <w:r>
-        <w:tab/>
-      </w:r>
-      <w:r>
-        <w:t>Student Attendee, Southeastern Society of American Foresters Annual Meeting</w:t>
       </w:r>
     </w:p>
     <w:p>
@@ -2989,6 +3004,7 @@
   <w:style w:type="character" w:default="1" w:styleId="DefaultParagraphFont">
     <w:name w:val="Default Paragraph Font"/>
     <w:uiPriority w:val="1"/>
+    <w:semiHidden/>
     <w:unhideWhenUsed/>
   </w:style>
   <w:style w:type="table" w:default="1" w:styleId="TableNormal">

</xml_diff>